<commit_message>
genericized sdd-generator and added a Windows-specific COM pptx skill
</commit_message>
<xml_diff>
--- a/product-manager/skills/sdd-generator/assets/SDD_template.docx
+++ b/product-manager/skills/sdd-generator/assets/SDD_template.docx
@@ -1410,7 +1410,7 @@
           </w:tcPr>
           <w:p>
             <w:r>
-              <w:t>Name.surname@solomonpartners.com</w:t>
+              <w:t>name@example.com</w:t>
             </w:r>
           </w:p>
         </w:tc>
@@ -1465,7 +1465,7 @@
           </w:tcPr>
           <w:p>
             <w:r>
-              <w:t>Name.surname@solomonpartners.com</w:t>
+              <w:t>name@example.com</w:t>
             </w:r>
           </w:p>
         </w:tc>
@@ -1517,7 +1517,7 @@
           </w:tcPr>
           <w:p>
             <w:r>
-              <w:t>Name.surname@solomonpartners.com</w:t>
+              <w:t>name@example.com</w:t>
             </w:r>
           </w:p>
         </w:tc>
@@ -4310,7 +4310,7 @@
           </w:tcPr>
           <w:p>
             <w:r>
-              <w:t>Name.surname@solomonpartners.com</w:t>
+              <w:t>name@example.com</w:t>
             </w:r>
           </w:p>
         </w:tc>
@@ -4351,7 +4351,7 @@
           </w:tcPr>
           <w:p>
             <w:r>
-              <w:t>Name.surname@solomonpartners.com</w:t>
+              <w:t>name@example.com</w:t>
             </w:r>
           </w:p>
         </w:tc>
@@ -4392,7 +4392,7 @@
           </w:tcPr>
           <w:p>
             <w:r>
-              <w:t>Name.surname@solomonpartners.com</w:t>
+              <w:t>name@example.com</w:t>
             </w:r>
           </w:p>
         </w:tc>
@@ -10151,7 +10151,7 @@
 <file path=word/theme/theme1.xml><?xml version="1.0" encoding="utf-8"?>
 <a:theme xmlns:a="http://schemas.openxmlformats.org/drawingml/2006/main" name="Office Theme">
   <a:themeElements>
-    <a:clrScheme name="2025 Solomon Partners">
+    <a:clrScheme name="Standard SDD Theme">
       <a:dk1>
         <a:srgbClr val="000000"/>
       </a:dk1>
@@ -10189,7 +10189,7 @@
         <a:srgbClr val="003594"/>
       </a:folHlink>
     </a:clrScheme>
-    <a:fontScheme name="2025 Solomon Branding">
+    <a:fontScheme name="Standard SDD Branding">
       <a:majorFont>
         <a:latin typeface="Segoe UI Semibold"/>
         <a:ea typeface=""/>
@@ -10364,10 +10364,10 @@
 <LibraryInfo vendor="Macabacus" version="9.8.0.0">
   <LibraryId>7f0faa</LibraryId>
   <Permission>2</Permission>
-  <ContentPath><![CDATA[%USER_FOLDER%\OneDrive - Solomon Partners, L.P\Macabacus - Documents\Solomon\Images\8bc150\ed8506.png]]></ContentPath>
+  <ContentPath><![CDATA[%USER_FOLDER%\Documents\SDD\Images\organization-logo-placeholder.png]]></ContentPath>
   <ContentType>4</ContentType>
   <ContentId>deb54ffa996537be</ContentId>
-  <Title>Solomon Logo_Full Color (violet text)</Title>
+  <Title>Organization Logo Placeholder</Title>
   <CurrentVersion>1</CurrentVersion>
   <IgnoredVersion/>
   <KeepSrcFormatting>True</KeepSrcFormatting>
@@ -10599,10 +10599,10 @@
 <LibraryInfo vendor="Macabacus" version="9.8.0.0">
   <LibraryId>7f0faa</LibraryId>
   <Permission>2</Permission>
-  <ContentPath><![CDATA[%USER_FOLDER%\OneDrive - Solomon Partners, L.P\Macabacus - Documents\Solomon\Images\8bc150\ed8506.png]]></ContentPath>
+  <ContentPath><![CDATA[%USER_FOLDER%\Documents\SDD\Images\organization-logo-placeholder.png]]></ContentPath>
   <ContentType>4</ContentType>
   <ContentId>deb54ffa996537be</ContentId>
-  <Title>Solomon Logo_Full Color (violet text)</Title>
+  <Title>Organization Logo Placeholder</Title>
   <CurrentVersion>1</CurrentVersion>
   <IgnoredVersion/>
   <KeepSrcFormatting>True</KeepSrcFormatting>
@@ -10615,10 +10615,10 @@
 <LibraryInfo vendor="Macabacus" version="9.8.0.0">
   <LibraryId>7f0faa</LibraryId>
   <Permission>2</Permission>
-  <ContentPath><![CDATA[%USER_FOLDER%\OneDrive - Solomon Partners, L.P\Macabacus - Documents\Solomon\Images\8bc150\ed8506.png]]></ContentPath>
+  <ContentPath><![CDATA[%USER_FOLDER%\Documents\SDD\Images\organization-logo-placeholder.png]]></ContentPath>
   <ContentType>4</ContentType>
   <ContentId>deb54ffa996537be</ContentId>
-  <Title>Solomon Logo_Full Color (violet text)</Title>
+  <Title>Organization Logo Placeholder</Title>
   <CurrentVersion>1</CurrentVersion>
   <IgnoredVersion/>
   <KeepSrcFormatting>True</KeepSrcFormatting>

</xml_diff>